<commit_message>
Remove DRAFT version banners from white paper (HTML, PDF, DOCX) and keynote; rename speaker note label "Say:" to "Voice over:"; remove "new" badge from sources page cards
Co-Authored-By: Claude Sonnet 4.6 <noreply@anthropic.com>
</commit_message>
<xml_diff>
--- a/output/downloads/white-paper.docx
+++ b/output/downloads/white-paper.docx
@@ -17,15 +17,6 @@
           <w:color w:val="555555"/>
         </w:rPr>
         <w:t>How agentic commerce changes buying behaviour, and how brands, retailers and service businesses win</w:t>
-      </w:r>
-    </w:p>
-    <w:p>
-      <w:r>
-        <w:rPr>
-          <w:color w:val="996600"/>
-          <w:sz w:val="18"/>
-        </w:rPr>
-        <w:t>DRAFT v0.9: 70% source attributed, final comments processed · not yet published</w:t>
       </w:r>
     </w:p>
     <w:p>

</xml_diff>